<commit_message>
feat: selesaikan seluruh tugas UTS oop-kursus (Bagian 1-7)
</commit_message>
<xml_diff>
--- a/jobsheet7/Khohar Muhamad Fatahurrohman_Laporan_Jobsheet7.docx
+++ b/jobsheet7/Khohar Muhamad Fatahurrohman_Laporan_Jobsheet7.docx
@@ -329,10 +329,9 @@
         <w:rPr>
           <w:noProof/>
         </w:rPr>
-        <w:lastRenderedPageBreak/>
         <w:drawing>
-          <wp:inline distT="0" distB="0" distL="0" distR="0" wp14:anchorId="167DAC40" wp14:editId="6E45D5EF">
-            <wp:extent cx="5303520" cy="5227755"/>
+          <wp:inline distT="0" distB="0" distL="0" distR="0" wp14:anchorId="167DAC40" wp14:editId="53B6C606">
+            <wp:extent cx="5303079" cy="2652665"/>
             <wp:effectExtent l="0" t="0" r="0" b="0"/>
             <wp:docPr id="2" name="Picture 2"/>
             <wp:cNvGraphicFramePr>
@@ -354,7 +353,7 @@
                   <pic:spPr>
                     <a:xfrm>
                       <a:off x="0" y="0"/>
-                      <a:ext cx="5303520" cy="5227755"/>
+                      <a:ext cx="5314109" cy="2658183"/>
                     </a:xfrm>
                     <a:prstGeom prst="rect">
                       <a:avLst/>
@@ -573,8 +572,8 @@
           <w:noProof/>
         </w:rPr>
         <w:drawing>
-          <wp:inline distT="0" distB="0" distL="0" distR="0" wp14:anchorId="62D142F5" wp14:editId="1102A885">
-            <wp:extent cx="5303520" cy="1071528"/>
+          <wp:inline distT="0" distB="0" distL="0" distR="0" wp14:anchorId="62D142F5" wp14:editId="2615FE0B">
+            <wp:extent cx="5301615" cy="2230967"/>
             <wp:effectExtent l="0" t="0" r="0" b="0"/>
             <wp:docPr id="6" name="Picture 6"/>
             <wp:cNvGraphicFramePr>
@@ -596,7 +595,7 @@
                   <pic:spPr>
                     <a:xfrm>
                       <a:off x="0" y="0"/>
-                      <a:ext cx="5303520" cy="1071528"/>
+                      <a:ext cx="5334125" cy="2244647"/>
                     </a:xfrm>
                     <a:prstGeom prst="rect">
                       <a:avLst/>
@@ -628,13 +627,82 @@
         <w:spacing w:after="80"/>
         <w:jc w:val="center"/>
       </w:pPr>
+    </w:p>
+    <w:p>
+      <w:pPr>
+        <w:spacing w:after="240"/>
+        <w:jc w:val="center"/>
+      </w:pPr>
+      <w:r>
+        <w:rPr>
+          <w:rFonts w:ascii="Calibri" w:hAnsi="Calibri"/>
+          <w:i/>
+          <w:sz w:val="19"/>
+        </w:rPr>
+        <w:lastRenderedPageBreak/>
+        <w:t xml:space="preserve">Gambar 6: Output </w:t>
+      </w:r>
+      <w:proofErr w:type="spellStart"/>
+      <w:r>
+        <w:rPr>
+          <w:rFonts w:ascii="Calibri" w:hAnsi="Calibri"/>
+          <w:i/>
+          <w:sz w:val="19"/>
+        </w:rPr>
+        <w:t>Eksekusi</w:t>
+      </w:r>
+      <w:proofErr w:type="spellEnd"/>
+      <w:r>
+        <w:rPr>
+          <w:rFonts w:ascii="Calibri" w:hAnsi="Calibri"/>
+          <w:i/>
+          <w:sz w:val="19"/>
+        </w:rPr>
+        <w:t xml:space="preserve"> </w:t>
+      </w:r>
+      <w:proofErr w:type="spellStart"/>
+      <w:r>
+        <w:rPr>
+          <w:rFonts w:ascii="Calibri" w:hAnsi="Calibri"/>
+          <w:i/>
+          <w:sz w:val="19"/>
+        </w:rPr>
+        <w:t>Tugas</w:t>
+      </w:r>
+      <w:proofErr w:type="spellEnd"/>
+      <w:r>
+        <w:rPr>
+          <w:rFonts w:ascii="Calibri" w:hAnsi="Calibri"/>
+          <w:i/>
+          <w:sz w:val="19"/>
+        </w:rPr>
+        <w:t xml:space="preserve"> </w:t>
+      </w:r>
+      <w:proofErr w:type="spellStart"/>
+      <w:r>
+        <w:rPr>
+          <w:rFonts w:ascii="Calibri" w:hAnsi="Calibri"/>
+          <w:i/>
+          <w:sz w:val="19"/>
+        </w:rPr>
+        <w:t>Mandiri</w:t>
+      </w:r>
+      <w:proofErr w:type="spellEnd"/>
+      <w:r>
+        <w:rPr>
+          <w:rFonts w:ascii="Calibri" w:hAnsi="Calibri"/>
+          <w:i/>
+          <w:sz w:val="19"/>
+        </w:rPr>
+        <w:t xml:space="preserve"> </w:t>
+      </w:r>
       <w:r>
         <w:rPr>
           <w:noProof/>
         </w:rPr>
         <w:drawing>
-          <wp:inline distT="0" distB="0" distL="0" distR="0" wp14:anchorId="2E079EEE" wp14:editId="7568D52B">
-            <wp:extent cx="5303520" cy="1071528"/>
+          <wp:inline distT="0" distB="0" distL="0" distR="0" wp14:anchorId="45365821" wp14:editId="50DFBAD6">
+            <wp:extent cx="5302119" cy="2082800"/>
             <wp:effectExtent l="0" t="0" r="0" b="0"/>
             <wp:docPr id="7" name="Picture 7"/>
             <wp:cNvGraphicFramePr>
@@ -656,7 +724,7 @@
                   <pic:spPr>
                     <a:xfrm>
                       <a:off x="0" y="0"/>
-                      <a:ext cx="5303520" cy="1071528"/>
+                      <a:ext cx="5317651" cy="2088902"/>
                     </a:xfrm>
                     <a:prstGeom prst="rect">
                       <a:avLst/>
@@ -668,19 +736,57 @@
           </wp:inline>
         </w:drawing>
       </w:r>
-    </w:p>
-    <w:p>
-      <w:pPr>
-        <w:spacing w:after="240"/>
-        <w:jc w:val="center"/>
-      </w:pPr>
       <w:r>
         <w:rPr>
           <w:rFonts w:ascii="Calibri" w:hAnsi="Calibri"/>
           <w:i/>
           <w:sz w:val="19"/>
         </w:rPr>
-        <w:t>Gambar 6: Output Eksekusi Tugas Mandiri (Uji Penarikan BusinessAccount Ditolak)</w:t>
+        <w:t xml:space="preserve"> </w:t>
+      </w:r>
+      <w:r>
+        <w:rPr>
+          <w:rFonts w:ascii="Calibri" w:hAnsi="Calibri"/>
+          <w:i/>
+          <w:sz w:val="19"/>
+        </w:rPr>
+        <w:t xml:space="preserve">(Uji </w:t>
+      </w:r>
+      <w:proofErr w:type="spellStart"/>
+      <w:r>
+        <w:rPr>
+          <w:rFonts w:ascii="Calibri" w:hAnsi="Calibri"/>
+          <w:i/>
+          <w:sz w:val="19"/>
+        </w:rPr>
+        <w:t>Penarikan</w:t>
+      </w:r>
+      <w:proofErr w:type="spellEnd"/>
+      <w:r>
+        <w:rPr>
+          <w:rFonts w:ascii="Calibri" w:hAnsi="Calibri"/>
+          <w:i/>
+          <w:sz w:val="19"/>
+        </w:rPr>
+        <w:t xml:space="preserve"> </w:t>
+      </w:r>
+      <w:proofErr w:type="spellStart"/>
+      <w:r>
+        <w:rPr>
+          <w:rFonts w:ascii="Calibri" w:hAnsi="Calibri"/>
+          <w:i/>
+          <w:sz w:val="19"/>
+        </w:rPr>
+        <w:t>BusinessAccount</w:t>
+      </w:r>
+      <w:proofErr w:type="spellEnd"/>
+      <w:r>
+        <w:rPr>
+          <w:rFonts w:ascii="Calibri" w:hAnsi="Calibri"/>
+          <w:i/>
+          <w:sz w:val="19"/>
+        </w:rPr>
+        <w:t xml:space="preserve"> Ditolak)</w:t>
       </w:r>
     </w:p>
     <w:p>
@@ -692,10 +798,9 @@
         <w:rPr>
           <w:noProof/>
         </w:rPr>
-        <w:lastRenderedPageBreak/>
         <w:drawing>
-          <wp:inline distT="0" distB="0" distL="0" distR="0" wp14:anchorId="51C6C21D" wp14:editId="5111B72A">
-            <wp:extent cx="5303520" cy="3669170"/>
+          <wp:inline distT="0" distB="0" distL="0" distR="0" wp14:anchorId="51C6C21D" wp14:editId="000E838E">
+            <wp:extent cx="5303318" cy="3793067"/>
             <wp:effectExtent l="0" t="0" r="0" b="0"/>
             <wp:docPr id="8" name="Picture 8"/>
             <wp:cNvGraphicFramePr>
@@ -717,7 +822,7 @@
                   <pic:spPr>
                     <a:xfrm>
                       <a:off x="0" y="0"/>
-                      <a:ext cx="5303520" cy="3669170"/>
+                      <a:ext cx="5305685" cy="3794760"/>
                     </a:xfrm>
                     <a:prstGeom prst="rect">
                       <a:avLst/>
@@ -767,7 +872,14 @@
         <w:rPr>
           <w:rFonts w:ascii="Calibri" w:hAnsi="Calibri"/>
         </w:rPr>
-        <w:t>1. Method Overriding: Pada langkah 1 sampai 3, kita menerapkan teknik refactoring dengan mengekstraksi aturan validasi saldo ke dalam method protected boolean canWithdraw(double amount). Hal ini memberikan ekstensi fleksibel bagi setiap subclass untuk mendefinisikan aturan penarikannya sendiri tanpa merusak alur transaksi dasar pada method withdraw(double amount). Di subclass SavingsAccount, CheckingAccount, dan BusinessAccount, method canWithdraw dan printInfo ditandai dengan anotasi @Override. Anotasi ini berfungsi sebagai instruksi eksplisit kepada compiler Java untuk memverifikasi kesesuaian signature method turunan terhadap method induknya, mencegah terjadinya kesalahan pengetikan nama atau parameter. Selain itu, pemanggilan super.printInfo() di dalam method printInfo() subclass menunjukkan pemanfaatan kembali (code reuse) fungsionalitas superclass sebelum menambahkan informasi spesifik milik masing-masing rekening.</w:t>
+        <w:t xml:space="preserve">1. Method Overriding: Pada langkah 1 sampai 3, kita menerapkan teknik refactoring dengan mengekstraksi aturan validasi saldo ke dalam method protected boolean canWithdraw(double amount). Hal ini memberikan ekstensi fleksibel bagi setiap subclass untuk mendefinisikan aturan penarikannya sendiri tanpa merusak alur transaksi dasar pada method withdraw(double amount). Di subclass SavingsAccount, CheckingAccount, dan BusinessAccount, method canWithdraw dan printInfo ditandai </w:t>
+      </w:r>
+      <w:r>
+        <w:rPr>
+          <w:rFonts w:ascii="Calibri" w:hAnsi="Calibri"/>
+        </w:rPr>
+        <w:lastRenderedPageBreak/>
+        <w:t>dengan anotasi @Override. Anotasi ini berfungsi sebagai instruksi eksplisit kepada compiler Java untuk memverifikasi kesesuaian signature method turunan terhadap method induknya, mencegah terjadinya kesalahan pengetikan nama atau parameter. Selain itu, pemanggilan super.printInfo() di dalam method printInfo() subclass menunjukkan pemanfaatan kembali (code reuse) fungsionalitas superclass sebelum menambahkan informasi spesifik milik masing-masing rekening.</w:t>
       </w:r>
     </w:p>
     <w:p>
@@ -791,7 +903,6 @@
         <w:rPr>
           <w:rFonts w:ascii="Calibri" w:hAnsi="Calibri"/>
         </w:rPr>
-        <w:lastRenderedPageBreak/>
         <w:t>3. Kendala dan Solusi: Kendala yang dihadapi saat menulis canWithdraw() pada subclass adalah atribut balance di superclass Account bersifat private. Subclass tidak dapat mengakses balance secara langsung. Solusinya adalah mengakses saldo menggunakan method getter publik getBalance() yang telah disediakan di superclass. Hal ini tetap mempertahankan prinsip enkapsulasi secara murni.</w:t>
       </w:r>
     </w:p>
@@ -909,7 +1020,11 @@
         <w:t xml:space="preserve">Pembuktian Polimorfisme Dinamis (Dynamic Method Dispatch): </w:t>
       </w:r>
       <w:r>
-        <w:t>Saat Bank.printAllAccounts() memanggil acc.printInfo() melalui perulangan pada array of Account[], Java Runtime Environment (JVM) secara dinamis memilih dan mengeksekusi method printInfo() milik objek riil di heap (SavingsAccount, CheckingAccount, atau BusinessAccount). Masing-masing rekening berhasil mencetak format baris induk diikuti baris tipe spesifik rekeningnya masing-masing secara otomatis tanpa perlu branching (if/else).</w:t>
+        <w:t xml:space="preserve">Saat Bank.printAllAccounts() memanggil acc.printInfo() melalui perulangan pada array of Account[], Java Runtime Environment (JVM) secara dinamis memilih dan mengeksekusi method printInfo() milik objek riil di heap (SavingsAccount, CheckingAccount, atau </w:t>
+      </w:r>
+      <w:r>
+        <w:lastRenderedPageBreak/>
+        <w:t>BusinessAccount). Masing-masing rekening berhasil mencetak format baris induk diikuti baris tipe spesifik rekeningnya masing-masing secara otomatis tanpa perlu branching (if/else).</w:t>
       </w:r>
     </w:p>
     <w:p>
@@ -982,7 +1097,6 @@
         <w:br/>
       </w:r>
       <w:r>
-        <w:lastRenderedPageBreak/>
         <w:t>Signature pada method yang di-override (seperti canWithdraw(double) dan printInfo()) harus persis sama antara subclass dan superclass (meliputi nama method, jumlah, urutan, serta tipe parameter). Sebaliknya, pada method yang di-overload (seperti deposit(double) dan deposit(double, String)), nama method sama persis namun daftar parameternya wajib berbeda (berbeda jumlah atau tipe data parameter).</w:t>
       </w:r>
     </w:p>

</xml_diff>